<commit_message>
feat(cms): 14 formulários vinculados aos serviços do catálogo de DEV
- Link do Serviço gravado no CMS (Directus) para os 13 restantes; 1400 já feito pelo usuário
- página Serviços em DEV com página do serviço e link Acessar serviço dos 14
- vinculos-cms.json com id, slug do serviço, formulário e URLs
- teste ponta a ponta: página do serviço → Acessar serviço → envio, SUCCEEDED com serviceSlug real
- notas, relatório consolidado e DOCX atualizados
</commit_message>
<xml_diff>
--- a/entregas/relatorio-consolidado-2026-10-27.docx
+++ b/entregas/relatorio-consolidado-2026-10-27.docx
@@ -149,7 +149,7 @@
         <w:rPr>
           <w:color w:val="244061"/>
         </w:rPr>
-        <w:t xml:space="preserve"> Nenhum dos 14 serviços existe no catálogo do portal de DEV. Os testes usaram o serviço de exemplo do Leonardo.</w:t>
+        <w:t xml:space="preserve"> Os 14 serviços do catálogo de DEV já abrem o formulário: o Link do Serviço foi gravado no CMS em 27/10/2026. Ver Serviços em DEV.</w:t>
       </w:r>
     </w:p>
     <w:p>
@@ -2192,6 +2192,12 @@
       </w:pPr>
       <w:r>
         <w:rPr>
+          <w:color w:val="244061"/>
+        </w:rPr>
+        <w:t>~~</w:t>
+      </w:r>
+      <w:r>
+        <w:rPr>
           <w:b/>
           <w:color w:val="244061"/>
         </w:rPr>
@@ -2201,7 +2207,7 @@
         <w:rPr>
           <w:color w:val="244061"/>
         </w:rPr>
-        <w:t xml:space="preserve"> Cadastrar os 14 serviços no catálogo do portal de DEV, ou indicar os slugs que já existem. Sem isso o link não funciona para o cidadão ("Erro ao enviar resposta!").</w:t>
+        <w:t>~~ Feito em 27/10/2026: os 14 serviços já existiam no CMS de DEV e receberam o Link do Serviço. Ver Serviços em DEV.</w:t>
       </w:r>
     </w:p>
     <w:p>
@@ -3894,7 +3900,7 @@
         <w:rPr>
           <w:color w:val="244061"/>
         </w:rPr>
-        <w:t>Leonardo: catálogo, destino do pedido e conexão de e-mail. Sem isso nenhum serviço vai ao ar.</w:t>
+        <w:t>Leonardo: destino do pedido e conexão de e-mail. Sem isso o pedido não chega ao órgão.</w:t>
       </w:r>
     </w:p>
     <w:p>

</xml_diff>